<commit_message>
fixed 2notes for red2
</commit_message>
<xml_diff>
--- a/notes/!!!!!!Обработка исключительных ситуаций.docx
+++ b/notes/!!!!!!Обработка исключительных ситуаций.docx
@@ -221,6 +221,9 @@
     </w:p>
     <w:p>
       <w:r>
+        <w:rPr>
+          <w:noProof/>
+        </w:rPr>
         <w:drawing>
           <wp:inline distT="0" distB="0" distL="0" distR="0" wp14:anchorId="3C533E51" wp14:editId="608A6B70">
             <wp:extent cx="4048690" cy="1324160"/>
@@ -322,6 +325,9 @@
     </w:p>
     <w:p>
       <w:r>
+        <w:rPr>
+          <w:noProof/>
+        </w:rPr>
         <w:drawing>
           <wp:inline distT="0" distB="0" distL="0" distR="0" wp14:anchorId="6A98E072" wp14:editId="300D18E3">
             <wp:extent cx="5940425" cy="1666240"/>
@@ -427,6 +433,9 @@
     </w:p>
     <w:p>
       <w:r>
+        <w:rPr>
+          <w:noProof/>
+        </w:rPr>
         <w:drawing>
           <wp:inline distT="0" distB="0" distL="0" distR="0" wp14:anchorId="797750D4" wp14:editId="7164DA76">
             <wp:extent cx="5658640" cy="1457528"/>
@@ -605,6 +614,9 @@
     </w:p>
     <w:p>
       <w:r>
+        <w:rPr>
+          <w:noProof/>
+        </w:rPr>
         <w:drawing>
           <wp:inline distT="0" distB="0" distL="0" distR="0" wp14:anchorId="2951C078" wp14:editId="405194AF">
             <wp:extent cx="3743847" cy="1362265"/>
@@ -703,6 +715,9 @@
     </w:p>
     <w:p>
       <w:r>
+        <w:rPr>
+          <w:noProof/>
+        </w:rPr>
         <w:drawing>
           <wp:inline distT="0" distB="0" distL="0" distR="0" wp14:anchorId="343625B5" wp14:editId="1C515D55">
             <wp:extent cx="3962953" cy="571580"/>
@@ -738,6 +753,271 @@
             </a:graphic>
           </wp:inline>
         </w:drawing>
+      </w:r>
+    </w:p>
+    <w:p>
+      <w:pPr>
+        <w:rPr>
+          <w:color w:val="FF0000"/>
+        </w:rPr>
+      </w:pPr>
+    </w:p>
+    <w:p>
+      <w:pPr>
+        <w:rPr>
+          <w:color w:val="FF0000"/>
+        </w:rPr>
+      </w:pPr>
+      <w:r>
+        <w:rPr>
+          <w:color w:val="FF0000"/>
+          <w:lang w:val="en-US"/>
+        </w:rPr>
+        <w:t>red</w:t>
+      </w:r>
+      <w:r>
+        <w:rPr>
+          <w:color w:val="FF0000"/>
+        </w:rPr>
+        <w:t>1:</w:t>
+      </w:r>
+      <w:r>
+        <w:rPr>
+          <w:color w:val="FF0000"/>
+        </w:rPr>
+        <w:t xml:space="preserve"> </w:t>
+      </w:r>
+      <w:r>
+        <w:rPr>
+          <w:color w:val="FF0000"/>
+        </w:rPr>
+        <w:t>пример с броском исключения в функции.</w:t>
+      </w:r>
+    </w:p>
+    <w:p>
+      <w:r>
+        <w:drawing>
+          <wp:inline distT="0" distB="0" distL="0" distR="0" wp14:anchorId="6775D479" wp14:editId="2E65051E">
+            <wp:extent cx="5496692" cy="3867690"/>
+            <wp:effectExtent l="0" t="0" r="8890" b="0"/>
+            <wp:docPr id="6" name="Рисунок 6"/>
+            <wp:cNvGraphicFramePr>
+              <a:graphicFrameLocks xmlns:a="http://schemas.openxmlformats.org/drawingml/2006/main" noChangeAspect="1"/>
+            </wp:cNvGraphicFramePr>
+            <a:graphic xmlns:a="http://schemas.openxmlformats.org/drawingml/2006/main">
+              <a:graphicData uri="http://schemas.openxmlformats.org/drawingml/2006/picture">
+                <pic:pic xmlns:pic="http://schemas.openxmlformats.org/drawingml/2006/picture">
+                  <pic:nvPicPr>
+                    <pic:cNvPr id="1" name=""/>
+                    <pic:cNvPicPr/>
+                  </pic:nvPicPr>
+                  <pic:blipFill>
+                    <a:blip r:embed="rId10"/>
+                    <a:stretch>
+                      <a:fillRect/>
+                    </a:stretch>
+                  </pic:blipFill>
+                  <pic:spPr>
+                    <a:xfrm>
+                      <a:off x="0" y="0"/>
+                      <a:ext cx="5496692" cy="3867690"/>
+                    </a:xfrm>
+                    <a:prstGeom prst="rect">
+                      <a:avLst/>
+                    </a:prstGeom>
+                  </pic:spPr>
+                </pic:pic>
+              </a:graphicData>
+            </a:graphic>
+          </wp:inline>
+        </w:drawing>
+      </w:r>
+    </w:p>
+    <w:p>
+      <w:pPr>
+        <w:rPr>
+          <w:color w:val="0F9ED5" w:themeColor="accent4"/>
+        </w:rPr>
+      </w:pPr>
+      <w:r>
+        <w:t xml:space="preserve">Функция </w:t>
+      </w:r>
+      <w:proofErr w:type="spellStart"/>
+      <w:proofErr w:type="gramStart"/>
+      <w:r>
+        <w:rPr>
+          <w:color w:val="0F9ED5" w:themeColor="accent4"/>
+        </w:rPr>
+        <w:t>divide</w:t>
+      </w:r>
+      <w:proofErr w:type="spellEnd"/>
+      <w:r>
+        <w:rPr>
+          <w:color w:val="0F9ED5" w:themeColor="accent4"/>
+        </w:rPr>
+        <w:t>(</w:t>
+      </w:r>
+      <w:proofErr w:type="gramEnd"/>
+      <w:r>
+        <w:rPr>
+          <w:color w:val="0F9ED5" w:themeColor="accent4"/>
+        </w:rPr>
+        <w:t xml:space="preserve">) </w:t>
+      </w:r>
+      <w:r>
+        <w:t xml:space="preserve">проверяет, </w:t>
+      </w:r>
+      <w:r>
+        <w:rPr>
+          <w:color w:val="0F9ED5" w:themeColor="accent4"/>
+        </w:rPr>
+        <w:t xml:space="preserve">не равен </w:t>
+      </w:r>
+      <w:r>
+        <w:t xml:space="preserve">ли знаменатель </w:t>
+      </w:r>
+      <w:r>
+        <w:rPr>
+          <w:color w:val="0F9ED5" w:themeColor="accent4"/>
+        </w:rPr>
+        <w:t>b нулю</w:t>
+      </w:r>
+      <w:r>
+        <w:t>.</w:t>
+      </w:r>
+      <w:r>
+        <w:br/>
+      </w:r>
+      <w:r>
+        <w:t xml:space="preserve">Если </w:t>
+      </w:r>
+      <w:r>
+        <w:rPr>
+          <w:color w:val="0F9ED5" w:themeColor="accent4"/>
+        </w:rPr>
+        <w:t>b == 0</w:t>
+      </w:r>
+      <w:r>
+        <w:t xml:space="preserve">, бросается исключение </w:t>
+      </w:r>
+      <w:proofErr w:type="spellStart"/>
+      <w:r>
+        <w:rPr>
+          <w:color w:val="0F9ED5" w:themeColor="accent4"/>
+        </w:rPr>
+        <w:t>std</w:t>
+      </w:r>
+      <w:proofErr w:type="spellEnd"/>
+      <w:r>
+        <w:rPr>
+          <w:color w:val="0F9ED5" w:themeColor="accent4"/>
+        </w:rPr>
+        <w:t>::</w:t>
+      </w:r>
+      <w:proofErr w:type="spellStart"/>
+      <w:r>
+        <w:rPr>
+          <w:color w:val="0F9ED5" w:themeColor="accent4"/>
+        </w:rPr>
+        <w:t>runtime_error</w:t>
+      </w:r>
+      <w:proofErr w:type="spellEnd"/>
+      <w:r>
+        <w:rPr>
+          <w:color w:val="0F9ED5" w:themeColor="accent4"/>
+        </w:rPr>
+        <w:t xml:space="preserve"> </w:t>
+      </w:r>
+      <w:r>
+        <w:t>с поясняющим сообщением</w:t>
+      </w:r>
+      <w:r>
+        <w:t xml:space="preserve"> о том что деление на </w:t>
+      </w:r>
+      <w:r>
+        <w:rPr>
+          <w:color w:val="0F9ED5" w:themeColor="accent4"/>
+        </w:rPr>
+        <w:t>0 будет равно нулю</w:t>
+      </w:r>
+      <w:r>
+        <w:t>.</w:t>
+      </w:r>
+      <w:r>
+        <w:br/>
+      </w:r>
+      <w:r>
+        <w:t xml:space="preserve">В </w:t>
+      </w:r>
+      <w:proofErr w:type="spellStart"/>
+      <w:r>
+        <w:rPr>
+          <w:color w:val="0F9ED5" w:themeColor="accent4"/>
+        </w:rPr>
+        <w:t>main</w:t>
+      </w:r>
+      <w:proofErr w:type="spellEnd"/>
+      <w:r>
+        <w:rPr>
+          <w:color w:val="0F9ED5" w:themeColor="accent4"/>
+        </w:rPr>
+        <w:t xml:space="preserve">() </w:t>
+      </w:r>
+      <w:r>
+        <w:t xml:space="preserve">код заключен в блок </w:t>
+      </w:r>
+      <w:proofErr w:type="spellStart"/>
+      <w:r>
+        <w:rPr>
+          <w:color w:val="0F9ED5" w:themeColor="accent4"/>
+        </w:rPr>
+        <w:t>try</w:t>
+      </w:r>
+      <w:proofErr w:type="spellEnd"/>
+      <w:r>
+        <w:t xml:space="preserve">, а в </w:t>
+      </w:r>
+      <w:proofErr w:type="spellStart"/>
+      <w:r>
+        <w:rPr>
+          <w:color w:val="0F9ED5" w:themeColor="accent4"/>
+        </w:rPr>
+        <w:t>catch</w:t>
+      </w:r>
+      <w:proofErr w:type="spellEnd"/>
+      <w:r>
+        <w:rPr>
+          <w:color w:val="0F9ED5" w:themeColor="accent4"/>
+        </w:rPr>
+        <w:t xml:space="preserve"> </w:t>
+      </w:r>
+      <w:r>
+        <w:t xml:space="preserve">перехватывается исключение и выводится </w:t>
+      </w:r>
+      <w:r>
+        <w:rPr>
+          <w:color w:val="0F9ED5" w:themeColor="accent4"/>
+        </w:rPr>
+        <w:t>сообщение об ошибке</w:t>
+      </w:r>
+      <w:r>
+        <w:rPr>
+          <w:color w:val="0F9ED5" w:themeColor="accent4"/>
+        </w:rPr>
+        <w:t xml:space="preserve"> через метод .</w:t>
+      </w:r>
+      <w:r>
+        <w:rPr>
+          <w:color w:val="0F9ED5" w:themeColor="accent4"/>
+          <w:lang w:val="en-US"/>
+        </w:rPr>
+        <w:t>what</w:t>
+      </w:r>
+      <w:r>
+        <w:rPr>
+          <w:color w:val="0F9ED5" w:themeColor="accent4"/>
+        </w:rPr>
+        <w:t xml:space="preserve">  объекта класса е.</w:t>
       </w:r>
     </w:p>
     <w:sectPr>

</xml_diff>